<commit_message>
docs: actualiza informe y agrega presentacion del proyecto (Entrega 1)
</commit_message>
<xml_diff>
--- a/docs/Proyecto GRC.docx
+++ b/docs/Proyecto GRC.docx
@@ -655,54 +655,1165 @@
     </w:p>
     <w:p>
       <w:pPr>
-        <w:keepNext w:val="0"/>
-        <w:keepLines w:val="0"/>
-        <w:pageBreakBefore w:val="0"/>
-        <w:widowControl w:val="1"/>
+        <w:rPr>
+          <w:b w:val="1"/>
+          <w:bCs w:val="1"/>
+        </w:rPr>
+      </w:pPr>
+      <w:r>
+        <w:rPr>
+          <w:rtl w:val="0"/>
+        </w:rPr>
+      </w:r>
+    </w:p>
+    <w:p>
+      <w:pPr>
+        <w:rPr>
+          <w:b w:val="1"/>
+          <w:bCs w:val="1"/>
+        </w:rPr>
+      </w:pPr>
+      <w:r>
+        <w:rPr>
+          <w:rtl w:val="0"/>
+        </w:rPr>
+      </w:r>
+    </w:p>
+    <w:sdt>
+      <w:sdtPr>
+        <w:id w:val="2009087818"/>
+        <w:docPartObj>
+          <w:docPartGallery w:val="Table of Contents"/>
+          <w:docPartUnique w:val="1"/>
+        </w:docPartObj>
+      </w:sdtPr>
+      <w:sdtContent>
+        <w:p>
+          <w:pPr>
+            <w:widowControl w:val="0"/>
+            <w:tabs>
+              <w:tab w:val="right" w:leader="none" w:pos="12000"/>
+            </w:tabs>
+            <w:spacing w:after="0" w:before="60" w:line="240" w:lineRule="auto"/>
+            <w:rPr>
+              <w:b w:val="1"/>
+              <w:bCs w:val="1"/>
+              <w:color w:val="000000"/>
+              <w:u w:val="none"/>
+            </w:rPr>
+          </w:pPr>
+          <w:r>
+            <w:fldChar w:fldCharType="begin"/>
+            <w:instrText xml:space="preserve"> TOC \h \u \z \t "Heading 1,1,Heading 2,2,Heading 3,3,Heading 4,4,Heading 5,5,Heading 6,6,"</w:instrText>
+            <w:fldChar w:fldCharType="separate"/>
+          </w:r>
+          <w:hyperlink w:anchor="_heading=h.mri3obw7hrpn">
+            <w:r>
+              <w:rPr>
+                <w:rFonts w:ascii="Calibri" w:cs="Calibri" w:eastAsia="Calibri" w:hAnsi="Calibri"/>
+                <w:b w:val="1"/>
+                <w:bCs w:val="1"/>
+                <w:i w:val="0"/>
+                <w:iCs w:val="0"/>
+                <w:smallCaps w:val="0"/>
+                <w:strike w:val="0"/>
+                <w:color w:val="000000"/>
+                <w:sz w:val="22"/>
+                <w:szCs w:val="22"/>
+                <w:u w:val="none"/>
+                <w:shd w:fill="auto" w:val="clear"/>
+                <w:vertAlign w:val="baseline"/>
+                <w:rtl w:val="0"/>
+              </w:rPr>
+              <w:t xml:space="preserve">A. PARTE I</w:t>
+              <w:tab/>
+              <w:t xml:space="preserve">3</w:t>
+            </w:r>
+          </w:hyperlink>
+          <w:r>
+            <w:rPr>
+              <w:rtl w:val="0"/>
+            </w:rPr>
+          </w:r>
+        </w:p>
+        <w:p>
+          <w:pPr>
+            <w:widowControl w:val="0"/>
+            <w:tabs>
+              <w:tab w:val="right" w:leader="none" w:pos="12000"/>
+            </w:tabs>
+            <w:spacing w:after="0" w:before="60" w:line="240" w:lineRule="auto"/>
+            <w:ind w:left="360" w:firstLine="0"/>
+            <w:rPr>
+              <w:color w:val="000000"/>
+              <w:u w:val="none"/>
+            </w:rPr>
+          </w:pPr>
+          <w:hyperlink w:anchor="_heading=h.28hr47r4i4bt">
+            <w:r>
+              <w:rPr>
+                <w:rFonts w:ascii="Calibri" w:cs="Calibri" w:eastAsia="Calibri" w:hAnsi="Calibri"/>
+                <w:b w:val="0"/>
+                <w:bCs w:val="0"/>
+                <w:i w:val="0"/>
+                <w:iCs w:val="0"/>
+                <w:smallCaps w:val="0"/>
+                <w:strike w:val="0"/>
+                <w:color w:val="000000"/>
+                <w:sz w:val="22"/>
+                <w:szCs w:val="22"/>
+                <w:u w:val="none"/>
+                <w:shd w:fill="auto" w:val="clear"/>
+                <w:vertAlign w:val="baseline"/>
+                <w:rtl w:val="0"/>
+              </w:rPr>
+              <w:t xml:space="preserve">1. Antecedentes Personales</w:t>
+              <w:tab/>
+              <w:t xml:space="preserve">3</w:t>
+            </w:r>
+          </w:hyperlink>
+          <w:r>
+            <w:rPr>
+              <w:rtl w:val="0"/>
+            </w:rPr>
+          </w:r>
+        </w:p>
+        <w:p>
+          <w:pPr>
+            <w:widowControl w:val="0"/>
+            <w:tabs>
+              <w:tab w:val="right" w:leader="none" w:pos="12000"/>
+            </w:tabs>
+            <w:spacing w:after="0" w:before="60" w:line="240" w:lineRule="auto"/>
+            <w:ind w:left="360" w:firstLine="0"/>
+            <w:rPr>
+              <w:color w:val="000000"/>
+              <w:u w:val="none"/>
+            </w:rPr>
+          </w:pPr>
+          <w:hyperlink w:anchor="_heading=h.tvpqe2zes72o">
+            <w:r>
+              <w:rPr>
+                <w:rFonts w:ascii="Calibri" w:cs="Calibri" w:eastAsia="Calibri" w:hAnsi="Calibri"/>
+                <w:b w:val="0"/>
+                <w:bCs w:val="0"/>
+                <w:i w:val="0"/>
+                <w:iCs w:val="0"/>
+                <w:smallCaps w:val="0"/>
+                <w:strike w:val="0"/>
+                <w:color w:val="000000"/>
+                <w:sz w:val="22"/>
+                <w:szCs w:val="22"/>
+                <w:u w:val="none"/>
+                <w:shd w:fill="auto" w:val="clear"/>
+                <w:vertAlign w:val="baseline"/>
+                <w:rtl w:val="0"/>
+              </w:rPr>
+              <w:t xml:space="preserve">2. Descripción Proyecto APT</w:t>
+              <w:tab/>
+              <w:t xml:space="preserve">4</w:t>
+            </w:r>
+          </w:hyperlink>
+          <w:r>
+            <w:rPr>
+              <w:rtl w:val="0"/>
+            </w:rPr>
+          </w:r>
+        </w:p>
+        <w:p>
+          <w:pPr>
+            <w:widowControl w:val="0"/>
+            <w:tabs>
+              <w:tab w:val="right" w:leader="none" w:pos="12000"/>
+            </w:tabs>
+            <w:spacing w:after="0" w:before="60" w:line="240" w:lineRule="auto"/>
+            <w:ind w:left="720" w:firstLine="0"/>
+            <w:rPr>
+              <w:color w:val="000000"/>
+              <w:u w:val="none"/>
+            </w:rPr>
+          </w:pPr>
+          <w:hyperlink w:anchor="_heading=h.zd4ge1cojqp0">
+            <w:r>
+              <w:rPr>
+                <w:rFonts w:ascii="Calibri" w:cs="Calibri" w:eastAsia="Calibri" w:hAnsi="Calibri"/>
+                <w:b w:val="0"/>
+                <w:bCs w:val="0"/>
+                <w:i w:val="0"/>
+                <w:iCs w:val="0"/>
+                <w:smallCaps w:val="0"/>
+                <w:strike w:val="0"/>
+                <w:color w:val="000000"/>
+                <w:sz w:val="22"/>
+                <w:szCs w:val="22"/>
+                <w:u w:val="none"/>
+                <w:shd w:fill="auto" w:val="clear"/>
+                <w:vertAlign w:val="baseline"/>
+                <w:rtl w:val="0"/>
+              </w:rPr>
+              <w:t xml:space="preserve">Nombre del proyecto</w:t>
+              <w:tab/>
+              <w:t xml:space="preserve">4</w:t>
+            </w:r>
+          </w:hyperlink>
+          <w:r>
+            <w:rPr>
+              <w:rtl w:val="0"/>
+            </w:rPr>
+          </w:r>
+        </w:p>
+        <w:p>
+          <w:pPr>
+            <w:widowControl w:val="0"/>
+            <w:tabs>
+              <w:tab w:val="right" w:leader="none" w:pos="12000"/>
+            </w:tabs>
+            <w:spacing w:after="0" w:before="60" w:line="240" w:lineRule="auto"/>
+            <w:ind w:left="720" w:firstLine="0"/>
+            <w:rPr>
+              <w:color w:val="000000"/>
+              <w:u w:val="none"/>
+            </w:rPr>
+          </w:pPr>
+          <w:hyperlink w:anchor="_heading=h.mlbe702dny3x">
+            <w:r>
+              <w:rPr>
+                <w:rFonts w:ascii="Calibri" w:cs="Calibri" w:eastAsia="Calibri" w:hAnsi="Calibri"/>
+                <w:b w:val="0"/>
+                <w:bCs w:val="0"/>
+                <w:i w:val="0"/>
+                <w:iCs w:val="0"/>
+                <w:smallCaps w:val="0"/>
+                <w:strike w:val="0"/>
+                <w:color w:val="000000"/>
+                <w:sz w:val="22"/>
+                <w:szCs w:val="22"/>
+                <w:u w:val="none"/>
+                <w:shd w:fill="auto" w:val="clear"/>
+                <w:vertAlign w:val="baseline"/>
+                <w:rtl w:val="0"/>
+              </w:rPr>
+              <w:t xml:space="preserve">Área (s) de desempeño(s)</w:t>
+              <w:tab/>
+              <w:t xml:space="preserve">4</w:t>
+            </w:r>
+          </w:hyperlink>
+          <w:r>
+            <w:rPr>
+              <w:rtl w:val="0"/>
+            </w:rPr>
+          </w:r>
+        </w:p>
+        <w:p>
+          <w:pPr>
+            <w:widowControl w:val="0"/>
+            <w:tabs>
+              <w:tab w:val="right" w:leader="none" w:pos="12000"/>
+            </w:tabs>
+            <w:spacing w:after="0" w:before="60" w:line="240" w:lineRule="auto"/>
+            <w:ind w:left="720" w:firstLine="0"/>
+            <w:rPr>
+              <w:color w:val="000000"/>
+              <w:u w:val="none"/>
+            </w:rPr>
+          </w:pPr>
+          <w:hyperlink w:anchor="_heading=h.56gu80v9h2ih">
+            <w:r>
+              <w:rPr>
+                <w:rFonts w:ascii="Calibri" w:cs="Calibri" w:eastAsia="Calibri" w:hAnsi="Calibri"/>
+                <w:b w:val="0"/>
+                <w:bCs w:val="0"/>
+                <w:i w:val="0"/>
+                <w:iCs w:val="0"/>
+                <w:smallCaps w:val="0"/>
+                <w:strike w:val="0"/>
+                <w:color w:val="000000"/>
+                <w:sz w:val="22"/>
+                <w:szCs w:val="22"/>
+                <w:u w:val="none"/>
+                <w:shd w:fill="auto" w:val="clear"/>
+                <w:vertAlign w:val="baseline"/>
+                <w:rtl w:val="0"/>
+              </w:rPr>
+              <w:t xml:space="preserve">Competencias</w:t>
+              <w:tab/>
+              <w:t xml:space="preserve">4</w:t>
+            </w:r>
+          </w:hyperlink>
+          <w:r>
+            <w:rPr>
+              <w:rtl w:val="0"/>
+            </w:rPr>
+          </w:r>
+        </w:p>
+        <w:p>
+          <w:pPr>
+            <w:widowControl w:val="0"/>
+            <w:tabs>
+              <w:tab w:val="right" w:leader="none" w:pos="12000"/>
+            </w:tabs>
+            <w:spacing w:after="0" w:before="60" w:line="240" w:lineRule="auto"/>
+            <w:ind w:left="360" w:firstLine="0"/>
+            <w:rPr>
+              <w:color w:val="000000"/>
+              <w:u w:val="none"/>
+            </w:rPr>
+          </w:pPr>
+          <w:hyperlink w:anchor="_heading=h.k53xrtdi6au">
+            <w:r>
+              <w:rPr>
+                <w:rFonts w:ascii="Calibri" w:cs="Calibri" w:eastAsia="Calibri" w:hAnsi="Calibri"/>
+                <w:b w:val="0"/>
+                <w:bCs w:val="0"/>
+                <w:i w:val="0"/>
+                <w:iCs w:val="0"/>
+                <w:smallCaps w:val="0"/>
+                <w:strike w:val="0"/>
+                <w:color w:val="000000"/>
+                <w:sz w:val="22"/>
+                <w:szCs w:val="22"/>
+                <w:u w:val="none"/>
+                <w:shd w:fill="auto" w:val="clear"/>
+                <w:vertAlign w:val="baseline"/>
+                <w:rtl w:val="0"/>
+              </w:rPr>
+              <w:t xml:space="preserve">3. Fundamentación Proyecto APT</w:t>
+              <w:tab/>
+              <w:t xml:space="preserve">5</w:t>
+            </w:r>
+          </w:hyperlink>
+          <w:r>
+            <w:rPr>
+              <w:rtl w:val="0"/>
+            </w:rPr>
+          </w:r>
+        </w:p>
+        <w:p>
+          <w:pPr>
+            <w:widowControl w:val="0"/>
+            <w:tabs>
+              <w:tab w:val="right" w:leader="none" w:pos="12000"/>
+            </w:tabs>
+            <w:spacing w:after="0" w:before="60" w:line="240" w:lineRule="auto"/>
+            <w:ind w:left="720" w:firstLine="0"/>
+            <w:rPr>
+              <w:color w:val="000000"/>
+              <w:u w:val="none"/>
+            </w:rPr>
+          </w:pPr>
+          <w:hyperlink w:anchor="_heading=h.1ofuacv1a9gg">
+            <w:r>
+              <w:rPr>
+                <w:rFonts w:ascii="Calibri" w:cs="Calibri" w:eastAsia="Calibri" w:hAnsi="Calibri"/>
+                <w:b w:val="0"/>
+                <w:bCs w:val="0"/>
+                <w:i w:val="0"/>
+                <w:iCs w:val="0"/>
+                <w:smallCaps w:val="0"/>
+                <w:strike w:val="0"/>
+                <w:color w:val="000000"/>
+                <w:sz w:val="22"/>
+                <w:szCs w:val="22"/>
+                <w:u w:val="none"/>
+                <w:shd w:fill="auto" w:val="clear"/>
+                <w:vertAlign w:val="baseline"/>
+                <w:rtl w:val="0"/>
+              </w:rPr>
+              <w:t xml:space="preserve">Relevancia del proyecto APT</w:t>
+              <w:tab/>
+              <w:t xml:space="preserve">5</w:t>
+            </w:r>
+          </w:hyperlink>
+          <w:r>
+            <w:rPr>
+              <w:rtl w:val="0"/>
+            </w:rPr>
+          </w:r>
+        </w:p>
+        <w:p>
+          <w:pPr>
+            <w:widowControl w:val="0"/>
+            <w:tabs>
+              <w:tab w:val="right" w:leader="none" w:pos="12000"/>
+            </w:tabs>
+            <w:spacing w:after="0" w:before="60" w:line="240" w:lineRule="auto"/>
+            <w:ind w:left="720" w:firstLine="0"/>
+            <w:rPr>
+              <w:color w:val="000000"/>
+              <w:u w:val="none"/>
+            </w:rPr>
+          </w:pPr>
+          <w:hyperlink w:anchor="_heading=h.azm9g24lzjv9">
+            <w:r>
+              <w:rPr>
+                <w:rFonts w:ascii="Calibri" w:cs="Calibri" w:eastAsia="Calibri" w:hAnsi="Calibri"/>
+                <w:b w:val="0"/>
+                <w:bCs w:val="0"/>
+                <w:i w:val="0"/>
+                <w:iCs w:val="0"/>
+                <w:smallCaps w:val="0"/>
+                <w:strike w:val="0"/>
+                <w:color w:val="000000"/>
+                <w:sz w:val="22"/>
+                <w:szCs w:val="22"/>
+                <w:u w:val="none"/>
+                <w:shd w:fill="auto" w:val="clear"/>
+                <w:vertAlign w:val="baseline"/>
+                <w:rtl w:val="0"/>
+              </w:rPr>
+              <w:t xml:space="preserve">Descripción del Proyecto APT</w:t>
+              <w:tab/>
+              <w:t xml:space="preserve">5</w:t>
+            </w:r>
+          </w:hyperlink>
+          <w:r>
+            <w:rPr>
+              <w:rtl w:val="0"/>
+            </w:rPr>
+          </w:r>
+        </w:p>
+        <w:p>
+          <w:pPr>
+            <w:widowControl w:val="0"/>
+            <w:tabs>
+              <w:tab w:val="right" w:leader="none" w:pos="12000"/>
+            </w:tabs>
+            <w:spacing w:after="0" w:before="60" w:line="240" w:lineRule="auto"/>
+            <w:ind w:left="720" w:firstLine="0"/>
+            <w:rPr>
+              <w:color w:val="000000"/>
+              <w:u w:val="none"/>
+            </w:rPr>
+          </w:pPr>
+          <w:hyperlink w:anchor="_heading=h.tdzicp7jpcgg">
+            <w:r>
+              <w:rPr>
+                <w:rFonts w:ascii="Calibri" w:cs="Calibri" w:eastAsia="Calibri" w:hAnsi="Calibri"/>
+                <w:b w:val="0"/>
+                <w:bCs w:val="0"/>
+                <w:i w:val="0"/>
+                <w:iCs w:val="0"/>
+                <w:smallCaps w:val="0"/>
+                <w:strike w:val="0"/>
+                <w:color w:val="000000"/>
+                <w:sz w:val="22"/>
+                <w:szCs w:val="22"/>
+                <w:u w:val="none"/>
+                <w:shd w:fill="auto" w:val="clear"/>
+                <w:vertAlign w:val="baseline"/>
+                <w:rtl w:val="0"/>
+              </w:rPr>
+              <w:t xml:space="preserve">Pertinencia del proyecto con el perfil de egreso</w:t>
+              <w:tab/>
+              <w:t xml:space="preserve">5</w:t>
+            </w:r>
+          </w:hyperlink>
+          <w:r>
+            <w:rPr>
+              <w:rtl w:val="0"/>
+            </w:rPr>
+          </w:r>
+        </w:p>
+        <w:p>
+          <w:pPr>
+            <w:widowControl w:val="0"/>
+            <w:tabs>
+              <w:tab w:val="right" w:leader="none" w:pos="12000"/>
+            </w:tabs>
+            <w:spacing w:after="0" w:before="60" w:line="240" w:lineRule="auto"/>
+            <w:ind w:left="720" w:firstLine="0"/>
+            <w:rPr>
+              <w:color w:val="000000"/>
+              <w:u w:val="none"/>
+            </w:rPr>
+          </w:pPr>
+          <w:hyperlink w:anchor="_heading=h.hd6z5lgxg5kl">
+            <w:r>
+              <w:rPr>
+                <w:rFonts w:ascii="Calibri" w:cs="Calibri" w:eastAsia="Calibri" w:hAnsi="Calibri"/>
+                <w:b w:val="0"/>
+                <w:bCs w:val="0"/>
+                <w:i w:val="0"/>
+                <w:iCs w:val="0"/>
+                <w:smallCaps w:val="0"/>
+                <w:strike w:val="0"/>
+                <w:color w:val="000000"/>
+                <w:sz w:val="22"/>
+                <w:szCs w:val="22"/>
+                <w:u w:val="none"/>
+                <w:shd w:fill="auto" w:val="clear"/>
+                <w:vertAlign w:val="baseline"/>
+                <w:rtl w:val="0"/>
+              </w:rPr>
+              <w:t xml:space="preserve">Relación con los intereses profesionales</w:t>
+              <w:tab/>
+              <w:t xml:space="preserve">6</w:t>
+            </w:r>
+          </w:hyperlink>
+          <w:r>
+            <w:rPr>
+              <w:rtl w:val="0"/>
+            </w:rPr>
+          </w:r>
+        </w:p>
+        <w:p>
+          <w:pPr>
+            <w:widowControl w:val="0"/>
+            <w:tabs>
+              <w:tab w:val="right" w:leader="none" w:pos="12000"/>
+            </w:tabs>
+            <w:spacing w:after="0" w:before="60" w:line="240" w:lineRule="auto"/>
+            <w:ind w:left="720" w:firstLine="0"/>
+            <w:rPr>
+              <w:color w:val="000000"/>
+              <w:u w:val="none"/>
+            </w:rPr>
+          </w:pPr>
+          <w:hyperlink w:anchor="_heading=h.4qyyatrjfeqn">
+            <w:r>
+              <w:rPr>
+                <w:rFonts w:ascii="Calibri" w:cs="Calibri" w:eastAsia="Calibri" w:hAnsi="Calibri"/>
+                <w:b w:val="0"/>
+                <w:bCs w:val="0"/>
+                <w:i w:val="0"/>
+                <w:iCs w:val="0"/>
+                <w:smallCaps w:val="0"/>
+                <w:strike w:val="0"/>
+                <w:color w:val="000000"/>
+                <w:sz w:val="22"/>
+                <w:szCs w:val="22"/>
+                <w:u w:val="none"/>
+                <w:shd w:fill="auto" w:val="clear"/>
+                <w:vertAlign w:val="baseline"/>
+                <w:rtl w:val="0"/>
+              </w:rPr>
+              <w:t xml:space="preserve">Factibilidad de desarrollo del Proyecto APT</w:t>
+              <w:tab/>
+              <w:t xml:space="preserve">6</w:t>
+            </w:r>
+          </w:hyperlink>
+          <w:r>
+            <w:rPr>
+              <w:rtl w:val="0"/>
+            </w:rPr>
+          </w:r>
+        </w:p>
+        <w:p>
+          <w:pPr>
+            <w:widowControl w:val="0"/>
+            <w:tabs>
+              <w:tab w:val="right" w:leader="none" w:pos="12000"/>
+            </w:tabs>
+            <w:spacing w:after="0" w:before="60" w:line="240" w:lineRule="auto"/>
+            <w:rPr>
+              <w:b w:val="1"/>
+              <w:bCs w:val="1"/>
+              <w:color w:val="000000"/>
+              <w:u w:val="none"/>
+            </w:rPr>
+          </w:pPr>
+          <w:hyperlink w:anchor="_heading=h.f788t22aqtjf">
+            <w:r>
+              <w:rPr>
+                <w:rFonts w:ascii="Calibri" w:cs="Calibri" w:eastAsia="Calibri" w:hAnsi="Calibri"/>
+                <w:b w:val="1"/>
+                <w:bCs w:val="1"/>
+                <w:i w:val="0"/>
+                <w:iCs w:val="0"/>
+                <w:smallCaps w:val="0"/>
+                <w:strike w:val="0"/>
+                <w:color w:val="000000"/>
+                <w:sz w:val="22"/>
+                <w:szCs w:val="22"/>
+                <w:u w:val="none"/>
+                <w:shd w:fill="auto" w:val="clear"/>
+                <w:vertAlign w:val="baseline"/>
+                <w:rtl w:val="0"/>
+              </w:rPr>
+              <w:t xml:space="preserve">B. PARTE II</w:t>
+              <w:tab/>
+              <w:t xml:space="preserve">8</w:t>
+            </w:r>
+          </w:hyperlink>
+          <w:r>
+            <w:rPr>
+              <w:rtl w:val="0"/>
+            </w:rPr>
+          </w:r>
+        </w:p>
+        <w:p>
+          <w:pPr>
+            <w:widowControl w:val="0"/>
+            <w:tabs>
+              <w:tab w:val="right" w:leader="none" w:pos="12000"/>
+            </w:tabs>
+            <w:spacing w:after="0" w:before="60" w:line="240" w:lineRule="auto"/>
+            <w:ind w:left="360" w:firstLine="0"/>
+            <w:rPr>
+              <w:color w:val="000000"/>
+              <w:u w:val="none"/>
+            </w:rPr>
+          </w:pPr>
+          <w:hyperlink w:anchor="_heading=h.6k6k4vi09gqr">
+            <w:r>
+              <w:rPr>
+                <w:rFonts w:ascii="Calibri" w:cs="Calibri" w:eastAsia="Calibri" w:hAnsi="Calibri"/>
+                <w:b w:val="0"/>
+                <w:bCs w:val="0"/>
+                <w:i w:val="0"/>
+                <w:iCs w:val="0"/>
+                <w:smallCaps w:val="0"/>
+                <w:strike w:val="0"/>
+                <w:color w:val="000000"/>
+                <w:sz w:val="22"/>
+                <w:szCs w:val="22"/>
+                <w:u w:val="none"/>
+                <w:shd w:fill="auto" w:val="clear"/>
+                <w:vertAlign w:val="baseline"/>
+                <w:rtl w:val="0"/>
+              </w:rPr>
+              <w:t xml:space="preserve">4. Objetivos</w:t>
+              <w:tab/>
+              <w:t xml:space="preserve">8</w:t>
+            </w:r>
+          </w:hyperlink>
+          <w:r>
+            <w:rPr>
+              <w:rtl w:val="0"/>
+            </w:rPr>
+          </w:r>
+        </w:p>
+        <w:p>
+          <w:pPr>
+            <w:widowControl w:val="0"/>
+            <w:tabs>
+              <w:tab w:val="right" w:leader="none" w:pos="12000"/>
+            </w:tabs>
+            <w:spacing w:after="0" w:before="60" w:line="240" w:lineRule="auto"/>
+            <w:ind w:left="720" w:firstLine="0"/>
+            <w:rPr>
+              <w:color w:val="000000"/>
+              <w:u w:val="none"/>
+            </w:rPr>
+          </w:pPr>
+          <w:hyperlink w:anchor="_heading=h.n5qvv2x2jt9h">
+            <w:r>
+              <w:rPr>
+                <w:rFonts w:ascii="Calibri" w:cs="Calibri" w:eastAsia="Calibri" w:hAnsi="Calibri"/>
+                <w:b w:val="0"/>
+                <w:bCs w:val="0"/>
+                <w:i w:val="0"/>
+                <w:iCs w:val="0"/>
+                <w:smallCaps w:val="0"/>
+                <w:strike w:val="0"/>
+                <w:color w:val="000000"/>
+                <w:sz w:val="22"/>
+                <w:szCs w:val="22"/>
+                <w:u w:val="none"/>
+                <w:shd w:fill="auto" w:val="clear"/>
+                <w:vertAlign w:val="baseline"/>
+                <w:rtl w:val="0"/>
+              </w:rPr>
+              <w:t xml:space="preserve">Objetivo general</w:t>
+              <w:tab/>
+              <w:t xml:space="preserve">8</w:t>
+            </w:r>
+          </w:hyperlink>
+          <w:r>
+            <w:rPr>
+              <w:rtl w:val="0"/>
+            </w:rPr>
+          </w:r>
+        </w:p>
+        <w:p>
+          <w:pPr>
+            <w:widowControl w:val="0"/>
+            <w:tabs>
+              <w:tab w:val="right" w:leader="none" w:pos="12000"/>
+            </w:tabs>
+            <w:spacing w:after="0" w:before="60" w:line="240" w:lineRule="auto"/>
+            <w:ind w:left="720" w:firstLine="0"/>
+            <w:rPr>
+              <w:color w:val="000000"/>
+              <w:u w:val="none"/>
+            </w:rPr>
+          </w:pPr>
+          <w:hyperlink w:anchor="_heading=h.z9fjif2pes94">
+            <w:r>
+              <w:rPr>
+                <w:rFonts w:ascii="Calibri" w:cs="Calibri" w:eastAsia="Calibri" w:hAnsi="Calibri"/>
+                <w:b w:val="0"/>
+                <w:bCs w:val="0"/>
+                <w:i w:val="0"/>
+                <w:iCs w:val="0"/>
+                <w:smallCaps w:val="0"/>
+                <w:strike w:val="0"/>
+                <w:color w:val="000000"/>
+                <w:sz w:val="22"/>
+                <w:szCs w:val="22"/>
+                <w:u w:val="none"/>
+                <w:shd w:fill="auto" w:val="clear"/>
+                <w:vertAlign w:val="baseline"/>
+                <w:rtl w:val="0"/>
+              </w:rPr>
+              <w:t xml:space="preserve">Objetivos específicos</w:t>
+              <w:tab/>
+              <w:t xml:space="preserve">8</w:t>
+            </w:r>
+          </w:hyperlink>
+          <w:r>
+            <w:rPr>
+              <w:rtl w:val="0"/>
+            </w:rPr>
+          </w:r>
+        </w:p>
+        <w:p>
+          <w:pPr>
+            <w:widowControl w:val="0"/>
+            <w:tabs>
+              <w:tab w:val="right" w:leader="none" w:pos="12000"/>
+            </w:tabs>
+            <w:spacing w:after="0" w:before="60" w:line="240" w:lineRule="auto"/>
+            <w:ind w:left="360" w:firstLine="0"/>
+            <w:rPr>
+              <w:color w:val="000000"/>
+              <w:u w:val="none"/>
+            </w:rPr>
+          </w:pPr>
+          <w:hyperlink w:anchor="_heading=h.845egk9598m6">
+            <w:r>
+              <w:rPr>
+                <w:rFonts w:ascii="Calibri" w:cs="Calibri" w:eastAsia="Calibri" w:hAnsi="Calibri"/>
+                <w:b w:val="0"/>
+                <w:bCs w:val="0"/>
+                <w:i w:val="0"/>
+                <w:iCs w:val="0"/>
+                <w:smallCaps w:val="0"/>
+                <w:strike w:val="0"/>
+                <w:color w:val="000000"/>
+                <w:sz w:val="22"/>
+                <w:szCs w:val="22"/>
+                <w:u w:val="none"/>
+                <w:shd w:fill="auto" w:val="clear"/>
+                <w:vertAlign w:val="baseline"/>
+                <w:rtl w:val="0"/>
+              </w:rPr>
+              <w:t xml:space="preserve">5. Metodología</w:t>
+              <w:tab/>
+              <w:t xml:space="preserve">9</w:t>
+            </w:r>
+          </w:hyperlink>
+          <w:r>
+            <w:rPr>
+              <w:rtl w:val="0"/>
+            </w:rPr>
+          </w:r>
+        </w:p>
+        <w:p>
+          <w:pPr>
+            <w:widowControl w:val="0"/>
+            <w:tabs>
+              <w:tab w:val="right" w:leader="none" w:pos="12000"/>
+            </w:tabs>
+            <w:spacing w:after="0" w:before="60" w:line="240" w:lineRule="auto"/>
+            <w:ind w:left="720" w:firstLine="0"/>
+            <w:rPr>
+              <w:color w:val="000000"/>
+              <w:u w:val="none"/>
+            </w:rPr>
+          </w:pPr>
+          <w:hyperlink w:anchor="_heading=h.mes5zq8cc658">
+            <w:r>
+              <w:rPr>
+                <w:rFonts w:ascii="Calibri" w:cs="Calibri" w:eastAsia="Calibri" w:hAnsi="Calibri"/>
+                <w:b w:val="0"/>
+                <w:bCs w:val="0"/>
+                <w:i w:val="0"/>
+                <w:iCs w:val="0"/>
+                <w:smallCaps w:val="0"/>
+                <w:strike w:val="0"/>
+                <w:color w:val="000000"/>
+                <w:sz w:val="22"/>
+                <w:szCs w:val="22"/>
+                <w:u w:val="none"/>
+                <w:shd w:fill="auto" w:val="clear"/>
+                <w:vertAlign w:val="baseline"/>
+                <w:rtl w:val="0"/>
+              </w:rPr>
+              <w:t xml:space="preserve">Descripción de la Metodología</w:t>
+              <w:tab/>
+              <w:t xml:space="preserve">9</w:t>
+            </w:r>
+          </w:hyperlink>
+          <w:r>
+            <w:rPr>
+              <w:rtl w:val="0"/>
+            </w:rPr>
+          </w:r>
+        </w:p>
+        <w:p>
+          <w:pPr>
+            <w:widowControl w:val="0"/>
+            <w:tabs>
+              <w:tab w:val="right" w:leader="none" w:pos="12000"/>
+            </w:tabs>
+            <w:spacing w:after="0" w:before="60" w:line="240" w:lineRule="auto"/>
+            <w:ind w:left="360" w:firstLine="0"/>
+            <w:rPr>
+              <w:color w:val="000000"/>
+              <w:u w:val="none"/>
+            </w:rPr>
+          </w:pPr>
+          <w:hyperlink w:anchor="_heading=h.1eahcuh73wkp">
+            <w:r>
+              <w:rPr>
+                <w:rFonts w:ascii="Calibri" w:cs="Calibri" w:eastAsia="Calibri" w:hAnsi="Calibri"/>
+                <w:b w:val="0"/>
+                <w:bCs w:val="0"/>
+                <w:i w:val="0"/>
+                <w:iCs w:val="0"/>
+                <w:smallCaps w:val="0"/>
+                <w:strike w:val="0"/>
+                <w:color w:val="000000"/>
+                <w:sz w:val="22"/>
+                <w:szCs w:val="22"/>
+                <w:u w:val="none"/>
+                <w:shd w:fill="auto" w:val="clear"/>
+                <w:vertAlign w:val="baseline"/>
+                <w:rtl w:val="0"/>
+              </w:rPr>
+              <w:t xml:space="preserve">6. Evidencias</w:t>
+              <w:tab/>
+              <w:t xml:space="preserve">10</w:t>
+            </w:r>
+          </w:hyperlink>
+          <w:r>
+            <w:rPr>
+              <w:rtl w:val="0"/>
+            </w:rPr>
+          </w:r>
+        </w:p>
+        <w:p>
+          <w:pPr>
+            <w:widowControl w:val="0"/>
+            <w:tabs>
+              <w:tab w:val="right" w:leader="none" w:pos="12000"/>
+            </w:tabs>
+            <w:spacing w:after="0" w:before="60" w:line="240" w:lineRule="auto"/>
+            <w:ind w:left="360" w:firstLine="0"/>
+            <w:rPr>
+              <w:color w:val="000000"/>
+              <w:u w:val="none"/>
+            </w:rPr>
+          </w:pPr>
+          <w:hyperlink w:anchor="_heading=h.aqhxtrmpcodh">
+            <w:r>
+              <w:rPr>
+                <w:rFonts w:ascii="Calibri" w:cs="Calibri" w:eastAsia="Calibri" w:hAnsi="Calibri"/>
+                <w:b w:val="0"/>
+                <w:bCs w:val="0"/>
+                <w:i w:val="0"/>
+                <w:iCs w:val="0"/>
+                <w:smallCaps w:val="0"/>
+                <w:strike w:val="0"/>
+                <w:color w:val="000000"/>
+                <w:sz w:val="22"/>
+                <w:szCs w:val="22"/>
+                <w:u w:val="none"/>
+                <w:shd w:fill="auto" w:val="clear"/>
+                <w:vertAlign w:val="baseline"/>
+                <w:rtl w:val="0"/>
+              </w:rPr>
+              <w:t xml:space="preserve">7. Plan de Trabajo</w:t>
+              <w:tab/>
+              <w:t xml:space="preserve">11</w:t>
+            </w:r>
+          </w:hyperlink>
+          <w:r>
+            <w:rPr>
+              <w:rtl w:val="0"/>
+            </w:rPr>
+          </w:r>
+        </w:p>
+        <w:p>
+          <w:pPr>
+            <w:widowControl w:val="0"/>
+            <w:tabs>
+              <w:tab w:val="right" w:leader="none" w:pos="12000"/>
+            </w:tabs>
+            <w:spacing w:after="0" w:before="60" w:line="240" w:lineRule="auto"/>
+            <w:ind w:left="720" w:firstLine="0"/>
+            <w:rPr>
+              <w:color w:val="000000"/>
+              <w:u w:val="none"/>
+            </w:rPr>
+          </w:pPr>
+          <w:hyperlink w:anchor="_heading=h.wpvcotvmen1b">
+            <w:r>
+              <w:rPr>
+                <w:rFonts w:ascii="Calibri" w:cs="Calibri" w:eastAsia="Calibri" w:hAnsi="Calibri"/>
+                <w:b w:val="0"/>
+                <w:bCs w:val="0"/>
+                <w:i w:val="0"/>
+                <w:iCs w:val="0"/>
+                <w:smallCaps w:val="0"/>
+                <w:strike w:val="0"/>
+                <w:color w:val="000000"/>
+                <w:sz w:val="22"/>
+                <w:szCs w:val="22"/>
+                <w:u w:val="none"/>
+                <w:shd w:fill="auto" w:val="clear"/>
+                <w:vertAlign w:val="baseline"/>
+                <w:rtl w:val="0"/>
+              </w:rPr>
+              <w:t xml:space="preserve">Plan de Trabajo Proyecto APT</w:t>
+              <w:tab/>
+              <w:t xml:space="preserve">11</w:t>
+            </w:r>
+          </w:hyperlink>
+          <w:r>
+            <w:rPr>
+              <w:rtl w:val="0"/>
+            </w:rPr>
+          </w:r>
+        </w:p>
+        <w:p>
+          <w:pPr>
+            <w:widowControl w:val="0"/>
+            <w:tabs>
+              <w:tab w:val="right" w:leader="none" w:pos="12000"/>
+            </w:tabs>
+            <w:spacing w:after="0" w:before="60" w:line="240" w:lineRule="auto"/>
+            <w:ind w:left="360" w:firstLine="0"/>
+            <w:rPr>
+              <w:color w:val="000000"/>
+              <w:u w:val="none"/>
+            </w:rPr>
+          </w:pPr>
+          <w:hyperlink w:anchor="_heading=h.2a0vkz8l0j9y">
+            <w:r>
+              <w:rPr>
+                <w:rFonts w:ascii="Calibri" w:cs="Calibri" w:eastAsia="Calibri" w:hAnsi="Calibri"/>
+                <w:b w:val="0"/>
+                <w:bCs w:val="0"/>
+                <w:i w:val="0"/>
+                <w:iCs w:val="0"/>
+                <w:smallCaps w:val="0"/>
+                <w:strike w:val="0"/>
+                <w:color w:val="000000"/>
+                <w:sz w:val="22"/>
+                <w:szCs w:val="22"/>
+                <w:u w:val="none"/>
+                <w:shd w:fill="auto" w:val="clear"/>
+                <w:vertAlign w:val="baseline"/>
+                <w:rtl w:val="0"/>
+              </w:rPr>
+              <w:t xml:space="preserve">8. Carta Gantt</w:t>
+              <w:tab/>
+              <w:t xml:space="preserve">13</w:t>
+            </w:r>
+          </w:hyperlink>
+          <w:r>
+            <w:rPr>
+              <w:rtl w:val="0"/>
+            </w:rPr>
+          </w:r>
+          <w:r>
+            <w:fldChar w:fldCharType="end"/>
+          </w:r>
+        </w:p>
+      </w:sdtContent>
+    </w:sdt>
+    <w:p>
+      <w:pPr>
+        <w:rPr>
+          <w:b w:val="1"/>
+          <w:bCs w:val="1"/>
+        </w:rPr>
+      </w:pPr>
+      <w:r>
+        <w:rPr>
+          <w:rtl w:val="0"/>
+        </w:rPr>
+      </w:r>
+    </w:p>
+    <w:p>
+      <w:pPr>
+        <w:rPr>
+          <w:b w:val="1"/>
+          <w:bCs w:val="1"/>
+        </w:rPr>
+      </w:pPr>
+      <w:r>
+        <w:rPr>
+          <w:rtl w:val="0"/>
+        </w:rPr>
+      </w:r>
+    </w:p>
+    <w:p>
+      <w:pPr>
+        <w:rPr>
+          <w:b w:val="1"/>
+          <w:bCs w:val="1"/>
+        </w:rPr>
+      </w:pPr>
+      <w:r>
+        <w:rPr>
+          <w:rtl w:val="0"/>
+        </w:rPr>
+      </w:r>
+    </w:p>
+    <w:p>
+      <w:pPr>
+        <w:rPr>
+          <w:b w:val="1"/>
+          <w:bCs w:val="1"/>
+        </w:rPr>
+      </w:pPr>
+      <w:r>
+        <w:rPr>
+          <w:rtl w:val="0"/>
+        </w:rPr>
+      </w:r>
+    </w:p>
+    <w:p>
+      <w:pPr>
+        <w:rPr>
+          <w:b w:val="1"/>
+          <w:bCs w:val="1"/>
+        </w:rPr>
+      </w:pPr>
+      <w:r>
+        <w:rPr>
+          <w:rtl w:val="0"/>
+        </w:rPr>
+      </w:r>
+    </w:p>
+    <w:p>
+      <w:pPr>
+        <w:rPr>
+          <w:b w:val="1"/>
+          <w:bCs w:val="1"/>
+        </w:rPr>
+      </w:pPr>
+      <w:r>
+        <w:rPr>
+          <w:rtl w:val="0"/>
+        </w:rPr>
+      </w:r>
+    </w:p>
+    <w:p>
+      <w:pPr>
+        <w:rPr>
+          <w:b w:val="1"/>
+          <w:bCs w:val="1"/>
+        </w:rPr>
+      </w:pPr>
+      <w:r>
+        <w:rPr>
+          <w:rtl w:val="0"/>
+        </w:rPr>
+      </w:r>
+    </w:p>
+    <w:p>
+      <w:pPr>
+        <w:rPr>
+          <w:b w:val="1"/>
+          <w:bCs w:val="1"/>
+        </w:rPr>
+      </w:pPr>
+      <w:r>
+        <w:rPr>
+          <w:rtl w:val="0"/>
+        </w:rPr>
+      </w:r>
+    </w:p>
+    <w:p>
+      <w:pPr>
+        <w:rPr>
+          <w:b w:val="1"/>
+          <w:bCs w:val="1"/>
+        </w:rPr>
+      </w:pPr>
+      <w:r>
+        <w:rPr>
+          <w:rtl w:val="0"/>
+        </w:rPr>
+      </w:r>
+    </w:p>
+    <w:p>
+      <w:pPr>
+        <w:rPr>
+          <w:b w:val="1"/>
+          <w:bCs w:val="1"/>
+        </w:rPr>
+      </w:pPr>
+      <w:r>
+        <w:rPr>
+          <w:rtl w:val="0"/>
+        </w:rPr>
+      </w:r>
+    </w:p>
+    <w:p>
+      <w:pPr>
+        <w:rPr>
+          <w:b w:val="1"/>
+          <w:bCs w:val="1"/>
+        </w:rPr>
+      </w:pPr>
+      <w:r>
+        <w:rPr>
+          <w:rtl w:val="0"/>
+        </w:rPr>
+      </w:r>
+    </w:p>
+    <w:p>
+      <w:pPr>
+        <w:rPr>
+          <w:b w:val="1"/>
+          <w:bCs w:val="1"/>
+        </w:rPr>
+      </w:pPr>
+      <w:r>
+        <w:rPr>
+          <w:rtl w:val="0"/>
+        </w:rPr>
+      </w:r>
+    </w:p>
+    <w:p>
+      <w:pPr>
+        <w:rPr>
+          <w:b w:val="1"/>
+          <w:bCs w:val="1"/>
+        </w:rPr>
+      </w:pPr>
+      <w:r>
+        <w:rPr>
+          <w:rtl w:val="0"/>
+        </w:rPr>
+      </w:r>
+    </w:p>
+    <w:p>
+      <w:pPr>
+        <w:pStyle w:val="Heading1"/>
         <w:numPr>
           <w:ilvl w:val="0"/>
           <w:numId w:val="2"/>
         </w:numPr>
-        <w:pBdr>
-          <w:top w:space="0" w:sz="0" w:val="nil"/>
-          <w:left w:space="0" w:sz="0" w:val="nil"/>
-          <w:bottom w:space="0" w:sz="0" w:val="nil"/>
-          <w:right w:space="0" w:sz="0" w:val="nil"/>
-          <w:between w:space="0" w:sz="0" w:val="nil"/>
-        </w:pBdr>
-        <w:shd w:fill="auto" w:val="clear"/>
-        <w:spacing w:after="160" w:before="0" w:line="259" w:lineRule="auto"/>
-        <w:ind w:left="720" w:right="0" w:hanging="360"/>
-        <w:jc w:val="left"/>
-        <w:rPr>
-          <w:b w:val="1"/>
-          <w:bCs w:val="1"/>
-          <w:i w:val="0"/>
-          <w:iCs w:val="0"/>
-          <w:smallCaps w:val="0"/>
-          <w:strike w:val="0"/>
+        <w:ind w:left="720" w:hanging="360"/>
+        <w:rPr>
           <w:color w:val="4472c4"/>
-          <w:sz w:val="32"/>
-          <w:szCs w:val="32"/>
-          <w:u w:val="none"/>
-          <w:shd w:fill="auto" w:val="clear"/>
-          <w:vertAlign w:val="baseline"/>
+          <w:sz w:val="28"/>
+          <w:szCs w:val="28"/>
         </w:rPr>
       </w:pPr>
+      <w:bookmarkStart w:colFirst="0" w:colLast="0" w:name="_heading=h.mri3obw7hrpn" w:id="0"/>
+      <w:bookmarkEnd w:id="0"/>
       <w:r>
         <w:rPr>
-          <w:rFonts w:ascii="Calibri" w:cs="Calibri" w:eastAsia="Calibri" w:hAnsi="Calibri"/>
-          <w:b w:val="1"/>
-          <w:bCs w:val="1"/>
-          <w:i w:val="0"/>
-          <w:iCs w:val="0"/>
-          <w:smallCaps w:val="0"/>
-          <w:strike w:val="0"/>
           <w:color w:val="4472c4"/>
-          <w:sz w:val="32"/>
-          <w:szCs w:val="32"/>
-          <w:u w:val="none"/>
-          <w:shd w:fill="auto" w:val="clear"/>
+          <w:sz w:val="28"/>
+          <w:szCs w:val="28"/>
           <w:vertAlign w:val="baseline"/>
           <w:rtl w:val="0"/>
         </w:rPr>
@@ -746,19 +1857,19 @@
           </w:tcPr>
           <w:p>
             <w:pPr>
-              <w:rPr>
-                <w:b w:val="1"/>
-                <w:bCs w:val="1"/>
-                <w:color w:val="1f3864"/>
+              <w:pStyle w:val="Heading2"/>
+              <w:spacing w:before="0" w:lineRule="auto"/>
+              <w:rPr>
+                <w:color w:val="4472c4"/>
                 <w:sz w:val="28"/>
                 <w:szCs w:val="28"/>
               </w:rPr>
             </w:pPr>
-            <w:r>
-              <w:rPr>
-                <w:b w:val="1"/>
-                <w:bCs w:val="1"/>
-                <w:color w:val="1f3864"/>
+            <w:bookmarkStart w:colFirst="0" w:colLast="0" w:name="_heading=h.28hr47r4i4bt" w:id="1"/>
+            <w:bookmarkEnd w:id="1"/>
+            <w:r>
+              <w:rPr>
+                <w:color w:val="4472c4"/>
                 <w:sz w:val="28"/>
                 <w:szCs w:val="28"/>
                 <w:rtl w:val="0"/>
@@ -1701,7 +2812,7 @@
       <w:tr>
         <w:trPr>
           <w:cantSplit w:val="0"/>
-          <w:trHeight w:val="440" w:hRule="atLeast"/>
+          <w:trHeight w:val="525" w:hRule="atLeast"/>
           <w:tblHeader w:val="0"/>
         </w:trPr>
         <w:tc>
@@ -1710,19 +2821,19 @@
           </w:tcPr>
           <w:p>
             <w:pPr>
-              <w:rPr>
-                <w:b w:val="1"/>
-                <w:bCs w:val="1"/>
-                <w:color w:val="1f3864"/>
+              <w:pStyle w:val="Heading2"/>
+              <w:spacing w:before="0" w:lineRule="auto"/>
+              <w:rPr>
+                <w:color w:val="4472c4"/>
                 <w:sz w:val="28"/>
                 <w:szCs w:val="28"/>
               </w:rPr>
             </w:pPr>
-            <w:r>
-              <w:rPr>
-                <w:b w:val="1"/>
-                <w:bCs w:val="1"/>
-                <w:color w:val="1f3864"/>
+            <w:bookmarkStart w:colFirst="0" w:colLast="0" w:name="_heading=h.tvpqe2zes72o" w:id="2"/>
+            <w:bookmarkEnd w:id="2"/>
+            <w:r>
+              <w:rPr>
+                <w:color w:val="4472c4"/>
                 <w:sz w:val="28"/>
                 <w:szCs w:val="28"/>
                 <w:rtl w:val="0"/>
@@ -1787,15 +2898,18 @@
           </w:tcPr>
           <w:p>
             <w:pPr>
-              <w:rPr>
-                <w:rFonts w:ascii="Calibri" w:cs="Calibri" w:eastAsia="Calibri" w:hAnsi="Calibri"/>
-                <w:color w:val="1f3864"/>
-              </w:rPr>
-            </w:pPr>
-            <w:r>
-              <w:rPr>
-                <w:rFonts w:ascii="Calibri" w:cs="Calibri" w:eastAsia="Calibri" w:hAnsi="Calibri"/>
-                <w:color w:val="1f3864"/>
+              <w:pStyle w:val="Heading3"/>
+              <w:rPr>
+                <w:sz w:val="22"/>
+                <w:szCs w:val="22"/>
+              </w:rPr>
+            </w:pPr>
+            <w:bookmarkStart w:colFirst="0" w:colLast="0" w:name="_heading=h.zd4ge1cojqp0" w:id="3"/>
+            <w:bookmarkEnd w:id="3"/>
+            <w:r>
+              <w:rPr>
+                <w:sz w:val="22"/>
+                <w:szCs w:val="22"/>
                 <w:rtl w:val="0"/>
               </w:rPr>
               <w:t xml:space="preserve">Nombre del proyecto</w:t>
@@ -1839,15 +2953,18 @@
           </w:tcPr>
           <w:p>
             <w:pPr>
-              <w:rPr>
-                <w:rFonts w:ascii="Calibri" w:cs="Calibri" w:eastAsia="Calibri" w:hAnsi="Calibri"/>
-                <w:color w:val="1f3864"/>
-              </w:rPr>
-            </w:pPr>
-            <w:r>
-              <w:rPr>
-                <w:rFonts w:ascii="Calibri" w:cs="Calibri" w:eastAsia="Calibri" w:hAnsi="Calibri"/>
-                <w:color w:val="1f3864"/>
+              <w:pStyle w:val="Heading3"/>
+              <w:rPr>
+                <w:sz w:val="22"/>
+                <w:szCs w:val="22"/>
+              </w:rPr>
+            </w:pPr>
+            <w:bookmarkStart w:colFirst="0" w:colLast="0" w:name="_heading=h.mlbe702dny3x" w:id="4"/>
+            <w:bookmarkEnd w:id="4"/>
+            <w:r>
+              <w:rPr>
+                <w:sz w:val="22"/>
+                <w:szCs w:val="22"/>
                 <w:rtl w:val="0"/>
               </w:rPr>
               <w:t xml:space="preserve">Área (s) de desempeño(s)</w:t>
@@ -1886,15 +3003,18 @@
           </w:tcPr>
           <w:p>
             <w:pPr>
-              <w:rPr>
-                <w:rFonts w:ascii="Calibri" w:cs="Calibri" w:eastAsia="Calibri" w:hAnsi="Calibri"/>
-                <w:color w:val="1f3864"/>
-              </w:rPr>
-            </w:pPr>
-            <w:r>
-              <w:rPr>
-                <w:rFonts w:ascii="Calibri" w:cs="Calibri" w:eastAsia="Calibri" w:hAnsi="Calibri"/>
-                <w:color w:val="1f3864"/>
+              <w:pStyle w:val="Heading3"/>
+              <w:rPr>
+                <w:sz w:val="22"/>
+                <w:szCs w:val="22"/>
+              </w:rPr>
+            </w:pPr>
+            <w:bookmarkStart w:colFirst="0" w:colLast="0" w:name="_heading=h.56gu80v9h2ih" w:id="5"/>
+            <w:bookmarkEnd w:id="5"/>
+            <w:r>
+              <w:rPr>
+                <w:sz w:val="22"/>
+                <w:szCs w:val="22"/>
                 <w:rtl w:val="0"/>
               </w:rPr>
               <w:t xml:space="preserve">Competencias </w:t>
@@ -2008,19 +3128,19 @@
           </w:tcPr>
           <w:p>
             <w:pPr>
-              <w:rPr>
-                <w:b w:val="1"/>
-                <w:bCs w:val="1"/>
-                <w:color w:val="1f3864"/>
+              <w:pStyle w:val="Heading2"/>
+              <w:spacing w:before="0" w:lineRule="auto"/>
+              <w:rPr>
+                <w:color w:val="4472c4"/>
                 <w:sz w:val="28"/>
                 <w:szCs w:val="28"/>
               </w:rPr>
             </w:pPr>
-            <w:r>
-              <w:rPr>
-                <w:b w:val="1"/>
-                <w:bCs w:val="1"/>
-                <w:color w:val="1f3864"/>
+            <w:bookmarkStart w:colFirst="0" w:colLast="0" w:name="_heading=h.k53xrtdi6au" w:id="6"/>
+            <w:bookmarkEnd w:id="6"/>
+            <w:r>
+              <w:rPr>
+                <w:color w:val="4472c4"/>
                 <w:sz w:val="28"/>
                 <w:szCs w:val="28"/>
                 <w:rtl w:val="0"/>
@@ -2087,15 +3207,18 @@
           </w:tcPr>
           <w:p>
             <w:pPr>
-              <w:rPr>
-                <w:rFonts w:ascii="Calibri" w:cs="Calibri" w:eastAsia="Calibri" w:hAnsi="Calibri"/>
-                <w:color w:val="1f3864"/>
-              </w:rPr>
-            </w:pPr>
-            <w:r>
-              <w:rPr>
-                <w:rFonts w:ascii="Calibri" w:cs="Calibri" w:eastAsia="Calibri" w:hAnsi="Calibri"/>
-                <w:color w:val="1f3864"/>
+              <w:pStyle w:val="Heading3"/>
+              <w:rPr>
+                <w:sz w:val="22"/>
+                <w:szCs w:val="22"/>
+              </w:rPr>
+            </w:pPr>
+            <w:bookmarkStart w:colFirst="0" w:colLast="0" w:name="_heading=h.1ofuacv1a9gg" w:id="7"/>
+            <w:bookmarkEnd w:id="7"/>
+            <w:r>
+              <w:rPr>
+                <w:sz w:val="22"/>
+                <w:szCs w:val="22"/>
                 <w:rtl w:val="0"/>
               </w:rPr>
               <w:t xml:space="preserve">Relevancia del proyecto APT</w:t>
@@ -2179,15 +3302,13 @@
           </w:tcPr>
           <w:p>
             <w:pPr>
-              <w:rPr>
-                <w:rFonts w:ascii="Calibri" w:cs="Calibri" w:eastAsia="Calibri" w:hAnsi="Calibri"/>
-                <w:color w:val="1f3864"/>
-              </w:rPr>
-            </w:pPr>
-            <w:r>
-              <w:rPr>
-                <w:rFonts w:ascii="Calibri" w:cs="Calibri" w:eastAsia="Calibri" w:hAnsi="Calibri"/>
-                <w:color w:val="1f3864"/>
+              <w:pStyle w:val="Heading3"/>
+              <w:rPr/>
+            </w:pPr>
+            <w:bookmarkStart w:colFirst="0" w:colLast="0" w:name="_heading=h.azm9g24lzjv9" w:id="8"/>
+            <w:bookmarkEnd w:id="8"/>
+            <w:r>
+              <w:rPr>
                 <w:rtl w:val="0"/>
               </w:rPr>
               <w:t xml:space="preserve">Descripción del Proyecto APT</w:t>
@@ -2253,15 +3374,18 @@
           </w:tcPr>
           <w:p>
             <w:pPr>
-              <w:rPr>
-                <w:rFonts w:ascii="Calibri" w:cs="Calibri" w:eastAsia="Calibri" w:hAnsi="Calibri"/>
-                <w:color w:val="1f3864"/>
-              </w:rPr>
-            </w:pPr>
-            <w:r>
-              <w:rPr>
-                <w:rFonts w:ascii="Calibri" w:cs="Calibri" w:eastAsia="Calibri" w:hAnsi="Calibri"/>
-                <w:color w:val="1f3864"/>
+              <w:pStyle w:val="Heading3"/>
+              <w:rPr>
+                <w:sz w:val="22"/>
+                <w:szCs w:val="22"/>
+              </w:rPr>
+            </w:pPr>
+            <w:bookmarkStart w:colFirst="0" w:colLast="0" w:name="_heading=h.tdzicp7jpcgg" w:id="9"/>
+            <w:bookmarkEnd w:id="9"/>
+            <w:r>
+              <w:rPr>
+                <w:sz w:val="22"/>
+                <w:szCs w:val="22"/>
                 <w:rtl w:val="0"/>
               </w:rPr>
               <w:t xml:space="preserve">Pertinencia del proyecto con el perfil de egreso</w:t>
@@ -2345,15 +3469,18 @@
           </w:tcPr>
           <w:p>
             <w:pPr>
-              <w:rPr>
-                <w:rFonts w:ascii="Calibri" w:cs="Calibri" w:eastAsia="Calibri" w:hAnsi="Calibri"/>
-                <w:color w:val="1f3864"/>
-              </w:rPr>
-            </w:pPr>
-            <w:r>
-              <w:rPr>
-                <w:rFonts w:ascii="Calibri" w:cs="Calibri" w:eastAsia="Calibri" w:hAnsi="Calibri"/>
-                <w:color w:val="1f3864"/>
+              <w:pStyle w:val="Heading3"/>
+              <w:rPr>
+                <w:sz w:val="22"/>
+                <w:szCs w:val="22"/>
+              </w:rPr>
+            </w:pPr>
+            <w:bookmarkStart w:colFirst="0" w:colLast="0" w:name="_heading=h.hd6z5lgxg5kl" w:id="10"/>
+            <w:bookmarkEnd w:id="10"/>
+            <w:r>
+              <w:rPr>
+                <w:sz w:val="22"/>
+                <w:szCs w:val="22"/>
                 <w:rtl w:val="0"/>
               </w:rPr>
               <w:t xml:space="preserve">Relación con los intereses profesionales</w:t>
@@ -2437,15 +3564,18 @@
           </w:tcPr>
           <w:p>
             <w:pPr>
-              <w:rPr>
-                <w:rFonts w:ascii="Calibri" w:cs="Calibri" w:eastAsia="Calibri" w:hAnsi="Calibri"/>
-                <w:color w:val="1f3864"/>
-              </w:rPr>
-            </w:pPr>
-            <w:r>
-              <w:rPr>
-                <w:rFonts w:ascii="Calibri" w:cs="Calibri" w:eastAsia="Calibri" w:hAnsi="Calibri"/>
-                <w:color w:val="1f3864"/>
+              <w:pStyle w:val="Heading3"/>
+              <w:rPr>
+                <w:sz w:val="22"/>
+                <w:szCs w:val="22"/>
+              </w:rPr>
+            </w:pPr>
+            <w:bookmarkStart w:colFirst="0" w:colLast="0" w:name="_heading=h.4qyyatrjfeqn" w:id="11"/>
+            <w:bookmarkEnd w:id="11"/>
+            <w:r>
+              <w:rPr>
+                <w:sz w:val="22"/>
+                <w:szCs w:val="22"/>
                 <w:rtl w:val="0"/>
               </w:rPr>
               <w:t xml:space="preserve">Factibilidad de desarrollo del Proyecto APT</w:t>
@@ -2817,54 +3947,25 @@
     </w:p>
     <w:p>
       <w:pPr>
-        <w:keepNext w:val="0"/>
-        <w:keepLines w:val="0"/>
-        <w:pageBreakBefore w:val="0"/>
-        <w:widowControl w:val="1"/>
+        <w:pStyle w:val="Heading1"/>
         <w:numPr>
           <w:ilvl w:val="0"/>
           <w:numId w:val="2"/>
         </w:numPr>
-        <w:pBdr>
-          <w:top w:space="0" w:sz="0" w:val="nil"/>
-          <w:left w:space="0" w:sz="0" w:val="nil"/>
-          <w:bottom w:space="0" w:sz="0" w:val="nil"/>
-          <w:right w:space="0" w:sz="0" w:val="nil"/>
-          <w:between w:space="0" w:sz="0" w:val="nil"/>
-        </w:pBdr>
-        <w:shd w:fill="auto" w:val="clear"/>
-        <w:spacing w:after="160" w:before="0" w:line="259" w:lineRule="auto"/>
-        <w:ind w:left="720" w:right="0" w:hanging="360"/>
-        <w:jc w:val="left"/>
-        <w:rPr>
-          <w:b w:val="1"/>
-          <w:bCs w:val="1"/>
-          <w:i w:val="0"/>
-          <w:iCs w:val="0"/>
-          <w:smallCaps w:val="0"/>
-          <w:strike w:val="0"/>
+        <w:ind w:left="720" w:hanging="360"/>
+        <w:rPr>
           <w:color w:val="4472c4"/>
-          <w:sz w:val="32"/>
-          <w:szCs w:val="32"/>
-          <w:u w:val="none"/>
-          <w:shd w:fill="auto" w:val="clear"/>
-          <w:vertAlign w:val="baseline"/>
+          <w:sz w:val="28"/>
+          <w:szCs w:val="28"/>
         </w:rPr>
       </w:pPr>
+      <w:bookmarkStart w:colFirst="0" w:colLast="0" w:name="_heading=h.f788t22aqtjf" w:id="12"/>
+      <w:bookmarkEnd w:id="12"/>
       <w:r>
         <w:rPr>
-          <w:rFonts w:ascii="Calibri" w:cs="Calibri" w:eastAsia="Calibri" w:hAnsi="Calibri"/>
-          <w:b w:val="1"/>
-          <w:bCs w:val="1"/>
-          <w:i w:val="0"/>
-          <w:iCs w:val="0"/>
-          <w:smallCaps w:val="0"/>
-          <w:strike w:val="0"/>
           <w:color w:val="4472c4"/>
-          <w:sz w:val="32"/>
-          <w:szCs w:val="32"/>
-          <w:u w:val="none"/>
-          <w:shd w:fill="auto" w:val="clear"/>
+          <w:sz w:val="28"/>
+          <w:szCs w:val="28"/>
           <w:vertAlign w:val="baseline"/>
           <w:rtl w:val="0"/>
         </w:rPr>
@@ -2908,19 +4009,19 @@
           </w:tcPr>
           <w:p>
             <w:pPr>
-              <w:rPr>
-                <w:b w:val="1"/>
-                <w:bCs w:val="1"/>
-                <w:color w:val="1f3864"/>
+              <w:pStyle w:val="Heading2"/>
+              <w:spacing w:before="0" w:lineRule="auto"/>
+              <w:rPr>
+                <w:color w:val="4472c4"/>
                 <w:sz w:val="28"/>
                 <w:szCs w:val="28"/>
               </w:rPr>
             </w:pPr>
-            <w:r>
-              <w:rPr>
-                <w:b w:val="1"/>
-                <w:bCs w:val="1"/>
-                <w:color w:val="1f3864"/>
+            <w:bookmarkStart w:colFirst="0" w:colLast="0" w:name="_heading=h.6k6k4vi09gqr" w:id="13"/>
+            <w:bookmarkEnd w:id="13"/>
+            <w:r>
+              <w:rPr>
+                <w:color w:val="4472c4"/>
                 <w:sz w:val="28"/>
                 <w:szCs w:val="28"/>
                 <w:rtl w:val="0"/>
@@ -2988,10 +4089,18 @@
           </w:tcPr>
           <w:p>
             <w:pPr>
-              <w:rPr/>
-            </w:pPr>
-            <w:r>
-              <w:rPr>
+              <w:pStyle w:val="Heading3"/>
+              <w:rPr>
+                <w:sz w:val="22"/>
+                <w:szCs w:val="22"/>
+              </w:rPr>
+            </w:pPr>
+            <w:bookmarkStart w:colFirst="0" w:colLast="0" w:name="_heading=h.n5qvv2x2jt9h" w:id="14"/>
+            <w:bookmarkEnd w:id="14"/>
+            <w:r>
+              <w:rPr>
+                <w:sz w:val="22"/>
+                <w:szCs w:val="22"/>
                 <w:rtl w:val="0"/>
               </w:rPr>
               <w:t xml:space="preserve">Objetivo general</w:t>
@@ -3038,13 +4147,18 @@
           </w:tcPr>
           <w:p>
             <w:pPr>
-              <w:rPr>
-                <w:color w:val="1f3864"/>
-              </w:rPr>
-            </w:pPr>
-            <w:r>
-              <w:rPr>
-                <w:color w:val="1f3864"/>
+              <w:pStyle w:val="Heading3"/>
+              <w:rPr>
+                <w:sz w:val="22"/>
+                <w:szCs w:val="22"/>
+              </w:rPr>
+            </w:pPr>
+            <w:bookmarkStart w:colFirst="0" w:colLast="0" w:name="_heading=h.z9fjif2pes94" w:id="15"/>
+            <w:bookmarkEnd w:id="15"/>
+            <w:r>
+              <w:rPr>
+                <w:sz w:val="22"/>
+                <w:szCs w:val="22"/>
                 <w:rtl w:val="0"/>
               </w:rPr>
               <w:t xml:space="preserve">Objetivos específicos</w:t>
@@ -3135,6 +4249,176 @@
         </w:tc>
       </w:tr>
     </w:tbl>
+    <w:p>
+      <w:pPr>
+        <w:spacing w:after="0" w:line="360" w:lineRule="auto"/>
+        <w:jc w:val="both"/>
+        <w:rPr>
+          <w:b w:val="1"/>
+          <w:bCs w:val="1"/>
+          <w:sz w:val="24"/>
+          <w:szCs w:val="24"/>
+        </w:rPr>
+      </w:pPr>
+      <w:r>
+        <w:rPr>
+          <w:rtl w:val="0"/>
+        </w:rPr>
+      </w:r>
+    </w:p>
+    <w:p>
+      <w:pPr>
+        <w:spacing w:after="0" w:line="360" w:lineRule="auto"/>
+        <w:jc w:val="both"/>
+        <w:rPr>
+          <w:b w:val="1"/>
+          <w:bCs w:val="1"/>
+          <w:sz w:val="24"/>
+          <w:szCs w:val="24"/>
+        </w:rPr>
+      </w:pPr>
+      <w:r>
+        <w:rPr>
+          <w:rtl w:val="0"/>
+        </w:rPr>
+      </w:r>
+    </w:p>
+    <w:p>
+      <w:pPr>
+        <w:spacing w:after="0" w:line="360" w:lineRule="auto"/>
+        <w:jc w:val="both"/>
+        <w:rPr>
+          <w:b w:val="1"/>
+          <w:bCs w:val="1"/>
+          <w:sz w:val="24"/>
+          <w:szCs w:val="24"/>
+        </w:rPr>
+      </w:pPr>
+      <w:r>
+        <w:rPr>
+          <w:rtl w:val="0"/>
+        </w:rPr>
+      </w:r>
+    </w:p>
+    <w:p>
+      <w:pPr>
+        <w:spacing w:after="0" w:line="360" w:lineRule="auto"/>
+        <w:jc w:val="both"/>
+        <w:rPr>
+          <w:b w:val="1"/>
+          <w:bCs w:val="1"/>
+          <w:sz w:val="24"/>
+          <w:szCs w:val="24"/>
+        </w:rPr>
+      </w:pPr>
+      <w:r>
+        <w:rPr>
+          <w:rtl w:val="0"/>
+        </w:rPr>
+      </w:r>
+    </w:p>
+    <w:p>
+      <w:pPr>
+        <w:spacing w:after="0" w:line="360" w:lineRule="auto"/>
+        <w:jc w:val="both"/>
+        <w:rPr>
+          <w:b w:val="1"/>
+          <w:bCs w:val="1"/>
+          <w:sz w:val="24"/>
+          <w:szCs w:val="24"/>
+        </w:rPr>
+      </w:pPr>
+      <w:r>
+        <w:rPr>
+          <w:rtl w:val="0"/>
+        </w:rPr>
+      </w:r>
+    </w:p>
+    <w:p>
+      <w:pPr>
+        <w:spacing w:after="0" w:line="360" w:lineRule="auto"/>
+        <w:jc w:val="both"/>
+        <w:rPr>
+          <w:b w:val="1"/>
+          <w:bCs w:val="1"/>
+          <w:sz w:val="24"/>
+          <w:szCs w:val="24"/>
+        </w:rPr>
+      </w:pPr>
+      <w:r>
+        <w:rPr>
+          <w:rtl w:val="0"/>
+        </w:rPr>
+      </w:r>
+    </w:p>
+    <w:p>
+      <w:pPr>
+        <w:spacing w:after="0" w:line="360" w:lineRule="auto"/>
+        <w:jc w:val="both"/>
+        <w:rPr>
+          <w:b w:val="1"/>
+          <w:bCs w:val="1"/>
+          <w:sz w:val="24"/>
+          <w:szCs w:val="24"/>
+        </w:rPr>
+      </w:pPr>
+      <w:r>
+        <w:rPr>
+          <w:rtl w:val="0"/>
+        </w:rPr>
+      </w:r>
+    </w:p>
+    <w:p>
+      <w:pPr>
+        <w:spacing w:after="0" w:line="360" w:lineRule="auto"/>
+        <w:jc w:val="both"/>
+        <w:rPr>
+          <w:b w:val="1"/>
+          <w:bCs w:val="1"/>
+          <w:sz w:val="24"/>
+          <w:szCs w:val="24"/>
+        </w:rPr>
+      </w:pPr>
+      <w:r>
+        <w:rPr>
+          <w:rtl w:val="0"/>
+        </w:rPr>
+      </w:r>
+    </w:p>
+    <w:p>
+      <w:pPr>
+        <w:spacing w:after="0" w:line="360" w:lineRule="auto"/>
+        <w:jc w:val="both"/>
+        <w:rPr>
+          <w:b w:val="1"/>
+          <w:bCs w:val="1"/>
+          <w:sz w:val="24"/>
+          <w:szCs w:val="24"/>
+        </w:rPr>
+      </w:pPr>
+      <w:r>
+        <w:rPr>
+          <w:rtl w:val="0"/>
+        </w:rPr>
+      </w:r>
+    </w:p>
+    <w:p>
+      <w:pPr>
+        <w:spacing w:after="0" w:line="360" w:lineRule="auto"/>
+        <w:jc w:val="both"/>
+        <w:rPr>
+          <w:b w:val="1"/>
+          <w:bCs w:val="1"/>
+          <w:sz w:val="24"/>
+          <w:szCs w:val="24"/>
+        </w:rPr>
+      </w:pPr>
+      <w:r>
+        <w:rPr>
+          <w:rtl w:val="0"/>
+        </w:rPr>
+      </w:r>
+    </w:p>
     <w:p>
       <w:pPr>
         <w:spacing w:after="0" w:line="360" w:lineRule="auto"/>
@@ -3206,19 +4490,19 @@
           </w:tcPr>
           <w:p>
             <w:pPr>
-              <w:rPr>
-                <w:b w:val="1"/>
-                <w:bCs w:val="1"/>
-                <w:color w:val="1f3864"/>
+              <w:pStyle w:val="Heading2"/>
+              <w:spacing w:before="0" w:lineRule="auto"/>
+              <w:rPr>
+                <w:color w:val="4472c4"/>
                 <w:sz w:val="28"/>
                 <w:szCs w:val="28"/>
               </w:rPr>
             </w:pPr>
-            <w:r>
-              <w:rPr>
-                <w:b w:val="1"/>
-                <w:bCs w:val="1"/>
-                <w:color w:val="1f3864"/>
+            <w:bookmarkStart w:colFirst="0" w:colLast="0" w:name="_heading=h.845egk9598m6" w:id="16"/>
+            <w:bookmarkEnd w:id="16"/>
+            <w:r>
+              <w:rPr>
+                <w:color w:val="4472c4"/>
                 <w:sz w:val="28"/>
                 <w:szCs w:val="28"/>
                 <w:rtl w:val="0"/>
@@ -3280,16 +4564,19 @@
           <w:tcPr/>
           <w:p>
             <w:pPr>
+              <w:pStyle w:val="Heading3"/>
               <w:jc w:val="center"/>
               <w:rPr>
-                <w:rFonts w:ascii="Calibri" w:cs="Calibri" w:eastAsia="Calibri" w:hAnsi="Calibri"/>
-                <w:color w:val="1f3864"/>
-              </w:rPr>
-            </w:pPr>
-            <w:r>
-              <w:rPr>
-                <w:rFonts w:ascii="Calibri" w:cs="Calibri" w:eastAsia="Calibri" w:hAnsi="Calibri"/>
-                <w:color w:val="1f3864"/>
+                <w:sz w:val="22"/>
+                <w:szCs w:val="22"/>
+              </w:rPr>
+            </w:pPr>
+            <w:bookmarkStart w:colFirst="0" w:colLast="0" w:name="_heading=h.mes5zq8cc658" w:id="17"/>
+            <w:bookmarkEnd w:id="17"/>
+            <w:r>
+              <w:rPr>
+                <w:sz w:val="22"/>
+                <w:szCs w:val="22"/>
                 <w:rtl w:val="0"/>
               </w:rPr>
               <w:t xml:space="preserve">Descripción de la Metodología</w:t>
@@ -3549,19 +4836,19 @@
           </w:tcPr>
           <w:p>
             <w:pPr>
-              <w:rPr>
-                <w:b w:val="1"/>
-                <w:bCs w:val="1"/>
-                <w:color w:val="1f3864"/>
+              <w:pStyle w:val="Heading2"/>
+              <w:spacing w:before="0" w:lineRule="auto"/>
+              <w:rPr>
+                <w:color w:val="4472c4"/>
                 <w:sz w:val="28"/>
                 <w:szCs w:val="28"/>
               </w:rPr>
             </w:pPr>
-            <w:r>
-              <w:rPr>
-                <w:b w:val="1"/>
-                <w:bCs w:val="1"/>
-                <w:color w:val="1f3864"/>
+            <w:bookmarkStart w:colFirst="0" w:colLast="0" w:name="_heading=h.1eahcuh73wkp" w:id="18"/>
+            <w:bookmarkEnd w:id="18"/>
+            <w:r>
+              <w:rPr>
+                <w:color w:val="4472c4"/>
                 <w:sz w:val="28"/>
                 <w:szCs w:val="28"/>
                 <w:rtl w:val="0"/>
@@ -5624,19 +6911,19 @@
           </w:tcPr>
           <w:p>
             <w:pPr>
-              <w:rPr>
-                <w:b w:val="1"/>
-                <w:bCs w:val="1"/>
-                <w:color w:val="1f3864"/>
+              <w:pStyle w:val="Heading2"/>
+              <w:spacing w:before="0" w:lineRule="auto"/>
+              <w:rPr>
+                <w:color w:val="4472c4"/>
                 <w:sz w:val="28"/>
                 <w:szCs w:val="28"/>
               </w:rPr>
             </w:pPr>
-            <w:r>
-              <w:rPr>
-                <w:b w:val="1"/>
-                <w:bCs w:val="1"/>
-                <w:color w:val="1f3864"/>
+            <w:bookmarkStart w:colFirst="0" w:colLast="0" w:name="_heading=h.aqhxtrmpcodh" w:id="19"/>
+            <w:bookmarkEnd w:id="19"/>
+            <w:r>
+              <w:rPr>
+                <w:color w:val="4472c4"/>
                 <w:sz w:val="28"/>
                 <w:szCs w:val="28"/>
                 <w:rtl w:val="0"/>
@@ -5711,26 +6998,22 @@
           </w:tcPr>
           <w:p>
             <w:pPr>
+              <w:pStyle w:val="Heading3"/>
               <w:jc w:val="center"/>
               <w:rPr>
-                <w:rFonts w:ascii="Calibri" w:cs="Calibri" w:eastAsia="Calibri" w:hAnsi="Calibri"/>
-                <w:color w:val="1f3864"/>
-              </w:rPr>
-            </w:pPr>
-            <w:r>
-              <w:rPr>
-                <w:rFonts w:ascii="Calibri" w:cs="Calibri" w:eastAsia="Calibri" w:hAnsi="Calibri"/>
-                <w:b w:val="1"/>
-                <w:bCs w:val="1"/>
-                <w:color w:val="1f3864"/>
+                <w:sz w:val="22"/>
+                <w:szCs w:val="22"/>
+              </w:rPr>
+            </w:pPr>
+            <w:bookmarkStart w:colFirst="0" w:colLast="0" w:name="_heading=h.wpvcotvmen1b" w:id="20"/>
+            <w:bookmarkEnd w:id="20"/>
+            <w:r>
+              <w:rPr>
+                <w:sz w:val="22"/>
+                <w:szCs w:val="22"/>
                 <w:rtl w:val="0"/>
               </w:rPr>
               <w:t xml:space="preserve">Plan de Trabajo Proyecto APT</w:t>
-            </w:r>
-            <w:r>
-              <w:rPr>
-                <w:rtl w:val="0"/>
-              </w:rPr>
             </w:r>
           </w:p>
         </w:tc>
@@ -9539,6 +10822,40 @@
         </w:tc>
       </w:tr>
     </w:tbl>
+    <w:p>
+      <w:pPr>
+        <w:spacing w:after="0" w:line="360" w:lineRule="auto"/>
+        <w:jc w:val="both"/>
+        <w:rPr>
+          <w:b w:val="1"/>
+          <w:bCs w:val="1"/>
+          <w:sz w:val="24"/>
+          <w:szCs w:val="24"/>
+        </w:rPr>
+      </w:pPr>
+      <w:r>
+        <w:rPr>
+          <w:rtl w:val="0"/>
+        </w:rPr>
+      </w:r>
+    </w:p>
+    <w:p>
+      <w:pPr>
+        <w:spacing w:after="0" w:line="360" w:lineRule="auto"/>
+        <w:jc w:val="both"/>
+        <w:rPr>
+          <w:b w:val="1"/>
+          <w:bCs w:val="1"/>
+          <w:sz w:val="24"/>
+          <w:szCs w:val="24"/>
+        </w:rPr>
+      </w:pPr>
+      <w:r>
+        <w:rPr>
+          <w:rtl w:val="0"/>
+        </w:rPr>
+      </w:r>
+    </w:p>
     <w:p>
       <w:pPr>
         <w:spacing w:after="0" w:line="360" w:lineRule="auto"/>
@@ -9788,7 +11105,7 @@
       <w:tr>
         <w:trPr>
           <w:cantSplit w:val="0"/>
-          <w:trHeight w:val="440" w:hRule="atLeast"/>
+          <w:trHeight w:val="513.8557942708333" w:hRule="atLeast"/>
           <w:tblHeader w:val="0"/>
         </w:trPr>
         <w:tc>
@@ -9797,19 +11114,19 @@
           </w:tcPr>
           <w:p>
             <w:pPr>
-              <w:rPr>
-                <w:b w:val="1"/>
-                <w:bCs w:val="1"/>
-                <w:color w:val="1f3864"/>
+              <w:pStyle w:val="Heading2"/>
+              <w:spacing w:before="0" w:lineRule="auto"/>
+              <w:rPr>
+                <w:color w:val="4472c4"/>
                 <w:sz w:val="28"/>
                 <w:szCs w:val="28"/>
               </w:rPr>
             </w:pPr>
-            <w:r>
-              <w:rPr>
-                <w:b w:val="1"/>
-                <w:bCs w:val="1"/>
-                <w:color w:val="1f3864"/>
+            <w:bookmarkStart w:colFirst="0" w:colLast="0" w:name="_heading=h.2a0vkz8l0j9y" w:id="21"/>
+            <w:bookmarkEnd w:id="21"/>
+            <w:r>
+              <w:rPr>
+                <w:color w:val="4472c4"/>
                 <w:sz w:val="28"/>
                 <w:szCs w:val="28"/>
                 <w:rtl w:val="0"/>
@@ -15726,12 +17043,54 @@
     </w:p>
     <w:sectPr>
       <w:headerReference r:id="rId8" w:type="default"/>
+      <w:headerReference r:id="rId9" w:type="first"/>
+      <w:footerReference r:id="rId10" w:type="default"/>
+      <w:footerReference r:id="rId11" w:type="first"/>
       <w:pgSz w:h="16838" w:w="11906" w:orient="portrait"/>
       <w:pgMar w:bottom="1417" w:top="1417" w:left="1701" w:right="1701" w:header="708" w:footer="708"/>
       <w:pgNumType w:start="1"/>
+      <w:titlePg w:val="1"/>
     </w:sectPr>
   </w:body>
 </w:document>
+</file>
+
+<file path=word/footer1.xml><?xml version="1.0" encoding="utf-8"?>
+<w:ftr xmlns:mc="http://schemas.openxmlformats.org/markup-compatibility/2006" xmlns:o="urn:schemas-microsoft-com:office:office" xmlns:r="http://schemas.openxmlformats.org/officeDocument/2006/relationships" xmlns:m="http://schemas.openxmlformats.org/officeDocument/2006/math" xmlns:v="urn:schemas-microsoft-com:vml" xmlns:wp="http://schemas.openxmlformats.org/drawingml/2006/wordprocessingDrawing" xmlns:w10="urn:schemas-microsoft-com:office:word" xmlns:w="http://schemas.openxmlformats.org/wordprocessingml/2006/main" xmlns:wne="http://schemas.microsoft.com/office/word/2006/wordml" xmlns:sl="http://schemas.openxmlformats.org/schemaLibrary/2006/main" xmlns:a="http://schemas.openxmlformats.org/drawingml/2006/main" xmlns:pic="http://schemas.openxmlformats.org/drawingml/2006/picture" xmlns:c="http://schemas.openxmlformats.org/drawingml/2006/chart" xmlns:lc="http://schemas.openxmlformats.org/drawingml/2006/lockedCanvas" xmlns:dgm="http://schemas.openxmlformats.org/drawingml/2006/diagram" xmlns:wps="http://schemas.microsoft.com/office/word/2010/wordprocessingShape" xmlns:wpg="http://schemas.microsoft.com/office/word/2010/wordprocessingGroup" xmlns:w14="http://schemas.microsoft.com/office/word/2010/wordml" xmlns:w15="http://schemas.microsoft.com/office/word/2012/wordml" xmlns:w16="http://schemas.microsoft.com/office/word/2018/wordml" xmlns:w16cex="http://schemas.microsoft.com/office/word/2018/wordml/cex" xmlns:w16cid="http://schemas.microsoft.com/office/word/2016/wordml/cid" xmlns="http://schemas.microsoft.com/office/tasks/2019/documenttasks" xmlns:cr="http://schemas.microsoft.com/office/comments/2020/reactions">
+  <w:p>
+    <w:pPr>
+      <w:jc w:val="right"/>
+      <w:rPr/>
+    </w:pPr>
+    <w:r>
+      <w:rPr/>
+      <w:fldChar w:fldCharType="begin"/>
+      <w:instrText xml:space="preserve">PAGE</w:instrText>
+      <w:fldChar w:fldCharType="separate"/>
+      <w:fldChar w:fldCharType="end"/>
+    </w:r>
+    <w:r>
+      <w:rPr>
+        <w:rtl w:val="0"/>
+      </w:rPr>
+    </w:r>
+  </w:p>
+</w:ftr>
+</file>
+
+<file path=word/footer2.xml><?xml version="1.0" encoding="utf-8"?>
+<w:ftr xmlns:mc="http://schemas.openxmlformats.org/markup-compatibility/2006" xmlns:o="urn:schemas-microsoft-com:office:office" xmlns:r="http://schemas.openxmlformats.org/officeDocument/2006/relationships" xmlns:m="http://schemas.openxmlformats.org/officeDocument/2006/math" xmlns:v="urn:schemas-microsoft-com:vml" xmlns:wp="http://schemas.openxmlformats.org/drawingml/2006/wordprocessingDrawing" xmlns:w10="urn:schemas-microsoft-com:office:word" xmlns:w="http://schemas.openxmlformats.org/wordprocessingml/2006/main" xmlns:wne="http://schemas.microsoft.com/office/word/2006/wordml" xmlns:sl="http://schemas.openxmlformats.org/schemaLibrary/2006/main" xmlns:a="http://schemas.openxmlformats.org/drawingml/2006/main" xmlns:pic="http://schemas.openxmlformats.org/drawingml/2006/picture" xmlns:c="http://schemas.openxmlformats.org/drawingml/2006/chart" xmlns:lc="http://schemas.openxmlformats.org/drawingml/2006/lockedCanvas" xmlns:dgm="http://schemas.openxmlformats.org/drawingml/2006/diagram" xmlns:wps="http://schemas.microsoft.com/office/word/2010/wordprocessingShape" xmlns:wpg="http://schemas.microsoft.com/office/word/2010/wordprocessingGroup" xmlns:w14="http://schemas.microsoft.com/office/word/2010/wordml" xmlns:w15="http://schemas.microsoft.com/office/word/2012/wordml" xmlns:w16="http://schemas.microsoft.com/office/word/2018/wordml" xmlns:w16cex="http://schemas.microsoft.com/office/word/2018/wordml/cex" xmlns:w16cid="http://schemas.microsoft.com/office/word/2016/wordml/cid" xmlns="http://schemas.microsoft.com/office/tasks/2019/documenttasks" xmlns:cr="http://schemas.microsoft.com/office/comments/2020/reactions">
+  <w:p>
+    <w:pPr>
+      <w:rPr/>
+    </w:pPr>
+    <w:r>
+      <w:rPr>
+        <w:rtl w:val="0"/>
+      </w:rPr>
+    </w:r>
+  </w:p>
+</w:ftr>
 </file>
 
 <file path=word/header1.xml><?xml version="1.0" encoding="utf-8"?>
@@ -15805,7 +17164,7 @@
     <w:tr>
       <w:trPr>
         <w:cantSplit w:val="0"/>
-        <w:trHeight w:val="697" w:hRule="atLeast"/>
+        <w:trHeight w:val="926.2605794270833" w:hRule="atLeast"/>
         <w:tblHeader w:val="0"/>
       </w:trPr>
       <w:tc>
@@ -15936,6 +17295,21 @@
         <w:shd w:fill="auto" w:val="clear"/>
         <w:vertAlign w:val="baseline"/>
       </w:rPr>
+    </w:pPr>
+    <w:r>
+      <w:rPr>
+        <w:rtl w:val="0"/>
+      </w:rPr>
+    </w:r>
+  </w:p>
+</w:hdr>
+</file>
+
+<file path=word/header2.xml><?xml version="1.0" encoding="utf-8"?>
+<w:hdr xmlns:mc="http://schemas.openxmlformats.org/markup-compatibility/2006" xmlns:o="urn:schemas-microsoft-com:office:office" xmlns:r="http://schemas.openxmlformats.org/officeDocument/2006/relationships" xmlns:m="http://schemas.openxmlformats.org/officeDocument/2006/math" xmlns:v="urn:schemas-microsoft-com:vml" xmlns:wp="http://schemas.openxmlformats.org/drawingml/2006/wordprocessingDrawing" xmlns:w10="urn:schemas-microsoft-com:office:word" xmlns:w="http://schemas.openxmlformats.org/wordprocessingml/2006/main" xmlns:wne="http://schemas.microsoft.com/office/word/2006/wordml" xmlns:sl="http://schemas.openxmlformats.org/schemaLibrary/2006/main" xmlns:a="http://schemas.openxmlformats.org/drawingml/2006/main" xmlns:pic="http://schemas.openxmlformats.org/drawingml/2006/picture" xmlns:c="http://schemas.openxmlformats.org/drawingml/2006/chart" xmlns:lc="http://schemas.openxmlformats.org/drawingml/2006/lockedCanvas" xmlns:dgm="http://schemas.openxmlformats.org/drawingml/2006/diagram" xmlns:wps="http://schemas.microsoft.com/office/word/2010/wordprocessingShape" xmlns:wpg="http://schemas.microsoft.com/office/word/2010/wordprocessingGroup" xmlns:w14="http://schemas.microsoft.com/office/word/2010/wordml" xmlns:w15="http://schemas.microsoft.com/office/word/2012/wordml" xmlns:w16="http://schemas.microsoft.com/office/word/2018/wordml" xmlns:w16cex="http://schemas.microsoft.com/office/word/2018/wordml/cex" xmlns:w16cid="http://schemas.microsoft.com/office/word/2016/wordml/cid" xmlns="http://schemas.microsoft.com/office/tasks/2019/documenttasks" xmlns:cr="http://schemas.microsoft.com/office/comments/2020/reactions">
+  <w:p>
+    <w:pPr>
+      <w:rPr/>
     </w:pPr>
     <w:r>
       <w:rPr>
@@ -17353,7 +18727,7 @@
 
 <file path=customXML/item1.xml><?xml version="1.0" encoding="utf-8"?>
 <go:gDocsCustomXmlDataStorage xmlns:go="http://customooxmlschemas.google.com/" xmlns:r="http://schemas.openxmlformats.org/officeDocument/2006/relationships" uri="GoogleDocsCustomDataVersion2">
-  <go:docsCustomData xmlns:go="http://customooxmlschemas.google.com/" roundtripDataSignature="AMtx7mh02dx6xYsWQHKe92Kn7UxeB/6w3A==">CgMxLjA4AHIhMU1WNGdWOFc1T0JPRFFWSjFaNW14YlEyQUdyYnoyVFZR</go:docsCustomData>
+  <go:docsCustomData xmlns:go="http://customooxmlschemas.google.com/" roundtripDataSignature="AMtx7mjeQ5DH36g6K7/ioa26mxh+ZDUUcg==">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</go:docsCustomData>
 </go:gDocsCustomXmlDataStorage>
 </file>
 

</xml_diff>